<commit_message>
Update RMS to version 2.
</commit_message>
<xml_diff>
--- a/docx-template/InstructionDocument.docx
+++ b/docx-template/InstructionDocument.docx
@@ -173,6 +173,8 @@
               </w:rPr>
               <w:t>EPT1</w:t>
             </w:r>
+            <w:bookmarkStart w:id="0" w:name="_GoBack"/>
+            <w:bookmarkEnd w:id="0"/>
           </w:p>
         </w:tc>
         <w:tc>
@@ -1396,12 +1398,10 @@
           <w:tab w:val="left" w:pos="9744"/>
         </w:tabs>
         <w:sectPr>
-          <w:headerReference w:type="even" r:id="rId8"/>
-          <w:headerReference w:type="default" r:id="rId9"/>
-          <w:footerReference w:type="even" r:id="rId10"/>
-          <w:footerReference w:type="default" r:id="rId11"/>
-          <w:headerReference w:type="first" r:id="rId12"/>
-          <w:footerReference w:type="first" r:id="rId13"/>
+          <w:headerReference w:type="default" r:id="rId8"/>
+          <w:footerReference w:type="default" r:id="rId9"/>
+          <w:headerReference w:type="first" r:id="rId10"/>
+          <w:footerReference w:type="first" r:id="rId11"/>
           <w:pgSz w:w="11906" w:h="16838"/>
           <w:pgMar w:top="96" w:right="424" w:bottom="357" w:left="454" w:header="113" w:footer="283" w:gutter="0"/>
           <w:pgNumType w:start="0"/>
@@ -1445,13 +1445,11 @@
                 <w:rFonts w:ascii="標楷體" w:hAnsi="標楷體"/>
               </w:rPr>
             </w:pPr>
-            <w:bookmarkStart w:id="0" w:name="目的"/>
-            <w:bookmarkStart w:id="1" w:name="_GoBack"/>
-            <w:bookmarkEnd w:id="1"/>
+            <w:bookmarkStart w:id="1" w:name="目的"/>
           </w:p>
         </w:tc>
       </w:tr>
-      <w:bookmarkEnd w:id="0"/>
+      <w:bookmarkEnd w:id="1"/>
     </w:tbl>
     <w:p>
       <w:pPr>
@@ -1466,7 +1464,7 @@
       </w:pPr>
     </w:p>
     <w:sectPr>
-      <w:headerReference w:type="default" r:id="rId14"/>
+      <w:headerReference w:type="default" r:id="rId12"/>
       <w:pgSz w:w="11906" w:h="16838"/>
       <w:pgMar w:top="96" w:right="454" w:bottom="357" w:left="426" w:header="113" w:footer="283" w:gutter="0"/>
       <w:pgNumType w:start="1" w:chapStyle="2"/>
@@ -1498,16 +1496,6 @@
 
 <file path=word/footer1.xml><?xml version="1.0" encoding="utf-8"?>
 <w:ftr xmlns:wpc="http://schemas.microsoft.com/office/word/2010/wordprocessingCanvas" xmlns:cx="http://schemas.microsoft.com/office/drawing/2014/chartex" xmlns:cx1="http://schemas.microsoft.com/office/drawing/2015/9/8/chartex" xmlns:mc="http://schemas.openxmlformats.org/markup-compatibility/2006" xmlns:o="urn:schemas-microsoft-com:office:office" xmlns:r="http://schemas.openxmlformats.org/officeDocument/2006/relationships" xmlns:m="http://schemas.openxmlformats.org/officeDocument/2006/math" xmlns:v="urn:schemas-microsoft-com:vml" xmlns:wp14="http://schemas.microsoft.com/office/word/2010/wordprocessingDrawing" xmlns:wp="http://schemas.openxmlformats.org/drawingml/2006/wordprocessingDrawing" xmlns:w10="urn:schemas-microsoft-com:office:word" xmlns:w="http://schemas.openxmlformats.org/wordprocessingml/2006/main" xmlns:w14="http://schemas.microsoft.com/office/word/2010/wordml" xmlns:w15="http://schemas.microsoft.com/office/word/2012/wordml" xmlns:w16se="http://schemas.microsoft.com/office/word/2015/wordml/symex" xmlns:wpg="http://schemas.microsoft.com/office/word/2010/wordprocessingGroup" xmlns:wpi="http://schemas.microsoft.com/office/word/2010/wordprocessingInk" xmlns:wne="http://schemas.microsoft.com/office/word/2006/wordml" xmlns:wps="http://schemas.microsoft.com/office/word/2010/wordprocessingShape" mc:Ignorable="w14 w15 w16se wp14">
-  <w:p>
-    <w:pPr>
-      <w:pStyle w:val="a5"/>
-    </w:pPr>
-  </w:p>
-</w:ftr>
-</file>
-
-<file path=word/footer2.xml><?xml version="1.0" encoding="utf-8"?>
-<w:ftr xmlns:wpc="http://schemas.microsoft.com/office/word/2010/wordprocessingCanvas" xmlns:cx="http://schemas.microsoft.com/office/drawing/2014/chartex" xmlns:cx1="http://schemas.microsoft.com/office/drawing/2015/9/8/chartex" xmlns:mc="http://schemas.openxmlformats.org/markup-compatibility/2006" xmlns:o="urn:schemas-microsoft-com:office:office" xmlns:r="http://schemas.openxmlformats.org/officeDocument/2006/relationships" xmlns:m="http://schemas.openxmlformats.org/officeDocument/2006/math" xmlns:v="urn:schemas-microsoft-com:vml" xmlns:wp14="http://schemas.microsoft.com/office/word/2010/wordprocessingDrawing" xmlns:wp="http://schemas.openxmlformats.org/drawingml/2006/wordprocessingDrawing" xmlns:w10="urn:schemas-microsoft-com:office:word" xmlns:w="http://schemas.openxmlformats.org/wordprocessingml/2006/main" xmlns:w14="http://schemas.microsoft.com/office/word/2010/wordml" xmlns:w15="http://schemas.microsoft.com/office/word/2012/wordml" xmlns:w16se="http://schemas.microsoft.com/office/word/2015/wordml/symex" xmlns:wpg="http://schemas.microsoft.com/office/word/2010/wordprocessingGroup" xmlns:wpi="http://schemas.microsoft.com/office/word/2010/wordprocessingInk" xmlns:wne="http://schemas.microsoft.com/office/word/2006/wordml" xmlns:wps="http://schemas.microsoft.com/office/word/2010/wordprocessingShape" mc:Ignorable="w14 w15 w16se wp14">
   <w:tbl>
     <w:tblPr>
       <w:tblStyle w:val="a7"/>
@@ -1537,13 +1525,13 @@
             <w:ind w:rightChars="330" w:right="792"/>
             <w:rPr>
               <w:rFonts w:cs="Arial"/>
-              <w:color w:val="FFFFFF" w:themeColor="background1"/>
+              <w:color w:val="767171" w:themeColor="background2" w:themeShade="80"/>
             </w:rPr>
           </w:pPr>
           <w:r>
             <w:rPr>
               <w:rFonts w:cs="Arial" w:hint="eastAsia"/>
-              <w:color w:val="FFFFFF" w:themeColor="background1"/>
+              <w:color w:val="767171" w:themeColor="background2" w:themeShade="80"/>
             </w:rPr>
             <w:t>DOC_KEY</w:t>
           </w:r>
@@ -1565,7 +1553,19 @@
             <w:rPr>
               <w:rFonts w:cs="Arial"/>
             </w:rPr>
-            <w:t>FM-R-MF-AZ-052 Rev7.0</w:t>
+            <w:t>FM-R-MF-AZ-052 Rev</w:t>
+          </w:r>
+          <w:r>
+            <w:rPr>
+              <w:rFonts w:cs="Arial" w:hint="eastAsia"/>
+            </w:rPr>
+            <w:t>8</w:t>
+          </w:r>
+          <w:r>
+            <w:rPr>
+              <w:rFonts w:cs="Arial"/>
+            </w:rPr>
+            <w:t>.0</w:t>
           </w:r>
         </w:p>
       </w:tc>
@@ -1583,7 +1583,7 @@
 </w:ftr>
 </file>
 
-<file path=word/footer3.xml><?xml version="1.0" encoding="utf-8"?>
+<file path=word/footer2.xml><?xml version="1.0" encoding="utf-8"?>
 <w:ftr xmlns:wpc="http://schemas.microsoft.com/office/word/2010/wordprocessingCanvas" xmlns:cx="http://schemas.microsoft.com/office/drawing/2014/chartex" xmlns:cx1="http://schemas.microsoft.com/office/drawing/2015/9/8/chartex" xmlns:mc="http://schemas.openxmlformats.org/markup-compatibility/2006" xmlns:o="urn:schemas-microsoft-com:office:office" xmlns:r="http://schemas.openxmlformats.org/officeDocument/2006/relationships" xmlns:m="http://schemas.openxmlformats.org/officeDocument/2006/math" xmlns:v="urn:schemas-microsoft-com:vml" xmlns:wp14="http://schemas.microsoft.com/office/word/2010/wordprocessingDrawing" xmlns:wp="http://schemas.openxmlformats.org/drawingml/2006/wordprocessingDrawing" xmlns:w10="urn:schemas-microsoft-com:office:word" xmlns:w="http://schemas.openxmlformats.org/wordprocessingml/2006/main" xmlns:w14="http://schemas.microsoft.com/office/word/2010/wordml" xmlns:w15="http://schemas.microsoft.com/office/word/2012/wordml" xmlns:w16se="http://schemas.microsoft.com/office/word/2015/wordml/symex" xmlns:wpg="http://schemas.microsoft.com/office/word/2010/wordprocessingGroup" xmlns:wpi="http://schemas.microsoft.com/office/word/2010/wordprocessingInk" xmlns:wne="http://schemas.microsoft.com/office/word/2006/wordml" xmlns:wps="http://schemas.microsoft.com/office/word/2010/wordprocessingShape" mc:Ignorable="w14 w15 w16se wp14">
   <w:p>
     <w:pPr>
@@ -1633,16 +1633,6 @@
 </file>
 
 <file path=word/header1.xml><?xml version="1.0" encoding="utf-8"?>
-<w:hdr xmlns:wpc="http://schemas.microsoft.com/office/word/2010/wordprocessingCanvas" xmlns:cx="http://schemas.microsoft.com/office/drawing/2014/chartex" xmlns:cx1="http://schemas.microsoft.com/office/drawing/2015/9/8/chartex" xmlns:mc="http://schemas.openxmlformats.org/markup-compatibility/2006" xmlns:o="urn:schemas-microsoft-com:office:office" xmlns:r="http://schemas.openxmlformats.org/officeDocument/2006/relationships" xmlns:m="http://schemas.openxmlformats.org/officeDocument/2006/math" xmlns:v="urn:schemas-microsoft-com:vml" xmlns:wp14="http://schemas.microsoft.com/office/word/2010/wordprocessingDrawing" xmlns:wp="http://schemas.openxmlformats.org/drawingml/2006/wordprocessingDrawing" xmlns:w10="urn:schemas-microsoft-com:office:word" xmlns:w="http://schemas.openxmlformats.org/wordprocessingml/2006/main" xmlns:w14="http://schemas.microsoft.com/office/word/2010/wordml" xmlns:w15="http://schemas.microsoft.com/office/word/2012/wordml" xmlns:w16se="http://schemas.microsoft.com/office/word/2015/wordml/symex" xmlns:wpg="http://schemas.microsoft.com/office/word/2010/wordprocessingGroup" xmlns:wpi="http://schemas.microsoft.com/office/word/2010/wordprocessingInk" xmlns:wne="http://schemas.microsoft.com/office/word/2006/wordml" xmlns:wps="http://schemas.microsoft.com/office/word/2010/wordprocessingShape" mc:Ignorable="w14 w15 w16se wp14">
-  <w:p>
-    <w:pPr>
-      <w:pStyle w:val="a3"/>
-    </w:pPr>
-  </w:p>
-</w:hdr>
-</file>
-
-<file path=word/header2.xml><?xml version="1.0" encoding="utf-8"?>
 <w:hdr xmlns:wpc="http://schemas.microsoft.com/office/word/2010/wordprocessingCanvas" xmlns:cx="http://schemas.microsoft.com/office/drawing/2014/chartex" xmlns:cx1="http://schemas.microsoft.com/office/drawing/2015/9/8/chartex" xmlns:mc="http://schemas.openxmlformats.org/markup-compatibility/2006" xmlns:o="urn:schemas-microsoft-com:office:office" xmlns:r="http://schemas.openxmlformats.org/officeDocument/2006/relationships" xmlns:m="http://schemas.openxmlformats.org/officeDocument/2006/math" xmlns:v="urn:schemas-microsoft-com:vml" xmlns:wp14="http://schemas.microsoft.com/office/word/2010/wordprocessingDrawing" xmlns:wp="http://schemas.openxmlformats.org/drawingml/2006/wordprocessingDrawing" xmlns:w10="urn:schemas-microsoft-com:office:word" xmlns:w="http://schemas.openxmlformats.org/wordprocessingml/2006/main" xmlns:w14="http://schemas.microsoft.com/office/word/2010/wordml" xmlns:w15="http://schemas.microsoft.com/office/word/2012/wordml" xmlns:w16se="http://schemas.microsoft.com/office/word/2015/wordml/symex" xmlns:wpg="http://schemas.microsoft.com/office/word/2010/wordprocessingGroup" xmlns:wpi="http://schemas.microsoft.com/office/word/2010/wordprocessingInk" xmlns:wne="http://schemas.microsoft.com/office/word/2006/wordml" xmlns:wps="http://schemas.microsoft.com/office/word/2010/wordprocessingShape" mc:Ignorable="w14 w15 w16se wp14">
   <w:p>
     <w:pPr>
@@ -1712,7 +1702,7 @@
       </w:trPr>
       <w:tc>
         <w:tcPr>
-          <w:tcW w:w="5513" w:type="dxa"/>
+          <w:tcW w:w="5556" w:type="dxa"/>
           <w:gridSpan w:val="3"/>
           <w:vMerge w:val="restart"/>
           <w:tcBorders>
@@ -1727,21 +1717,39 @@
           <w:pPr>
             <w:spacing w:line="240" w:lineRule="atLeast"/>
             <w:jc w:val="center"/>
+            <w:rPr>
+              <w:rFonts w:ascii="標楷體" w:hAnsi="標楷體"/>
+              <w:sz w:val="56"/>
+              <w:szCs w:val="56"/>
+            </w:rPr>
           </w:pPr>
           <w:r>
             <w:rPr>
-              <w:rFonts w:ascii="標楷體" w:hint="eastAsia"/>
+              <w:rFonts w:ascii="標楷體" w:hAnsi="標楷體" w:hint="eastAsia"/>
+              <w:spacing w:val="66"/>
               <w:kern w:val="0"/>
               <w:sz w:val="56"/>
               <w:szCs w:val="56"/>
+              <w:fitText w:val="4710" w:id="-944602624"/>
             </w:rPr>
-            <w:t>TITLE</w:t>
+            <w:t>製造條件指示</w:t>
+          </w:r>
+          <w:r>
+            <w:rPr>
+              <w:rFonts w:ascii="標楷體" w:hAnsi="標楷體" w:hint="eastAsia"/>
+              <w:spacing w:val="-1"/>
+              <w:kern w:val="0"/>
+              <w:sz w:val="56"/>
+              <w:szCs w:val="56"/>
+              <w:fitText w:val="4710" w:id="-944602624"/>
+            </w:rPr>
+            <w:t>書</w:t>
           </w:r>
         </w:p>
       </w:tc>
       <w:tc>
         <w:tcPr>
-          <w:tcW w:w="1545" w:type="dxa"/>
+          <w:tcW w:w="1557" w:type="dxa"/>
           <w:gridSpan w:val="2"/>
           <w:tcBorders>
             <w:top w:val="single" w:sz="18" w:space="0" w:color="auto"/>
@@ -1769,7 +1777,7 @@
       </w:tc>
       <w:tc>
         <w:tcPr>
-          <w:tcW w:w="2166" w:type="dxa"/>
+          <w:tcW w:w="2183" w:type="dxa"/>
           <w:gridSpan w:val="3"/>
           <w:tcBorders>
             <w:top w:val="single" w:sz="18" w:space="0" w:color="auto"/>
@@ -1794,7 +1802,7 @@
       </w:tc>
       <w:tc>
         <w:tcPr>
-          <w:tcW w:w="930" w:type="dxa"/>
+          <w:tcW w:w="937" w:type="dxa"/>
           <w:gridSpan w:val="2"/>
           <w:tcBorders>
             <w:top w:val="single" w:sz="18" w:space="0" w:color="auto"/>
@@ -1824,7 +1832,7 @@
       </w:tc>
       <w:tc>
         <w:tcPr>
-          <w:tcW w:w="930" w:type="dxa"/>
+          <w:tcW w:w="937" w:type="dxa"/>
           <w:tcBorders>
             <w:top w:val="single" w:sz="18" w:space="0" w:color="auto"/>
             <w:left w:val="single" w:sz="2" w:space="0" w:color="auto"/>
@@ -1860,7 +1868,7 @@
       </w:trPr>
       <w:tc>
         <w:tcPr>
-          <w:tcW w:w="5513" w:type="dxa"/>
+          <w:tcW w:w="5556" w:type="dxa"/>
           <w:gridSpan w:val="3"/>
           <w:vMerge/>
           <w:tcBorders>
@@ -1878,7 +1886,7 @@
       </w:tc>
       <w:tc>
         <w:tcPr>
-          <w:tcW w:w="1545" w:type="dxa"/>
+          <w:tcW w:w="1557" w:type="dxa"/>
           <w:gridSpan w:val="2"/>
           <w:tcBorders>
             <w:top w:val="single" w:sz="2" w:space="0" w:color="auto"/>
@@ -1906,7 +1914,7 @@
       </w:tc>
       <w:tc>
         <w:tcPr>
-          <w:tcW w:w="2166" w:type="dxa"/>
+          <w:tcW w:w="2183" w:type="dxa"/>
           <w:gridSpan w:val="3"/>
           <w:tcBorders>
             <w:top w:val="single" w:sz="2" w:space="0" w:color="auto"/>
@@ -1931,7 +1939,7 @@
       </w:tc>
       <w:tc>
         <w:tcPr>
-          <w:tcW w:w="930" w:type="dxa"/>
+          <w:tcW w:w="937" w:type="dxa"/>
           <w:gridSpan w:val="2"/>
           <w:tcBorders>
             <w:top w:val="single" w:sz="2" w:space="0" w:color="auto"/>
@@ -1956,7 +1964,7 @@
       </w:tc>
       <w:tc>
         <w:tcPr>
-          <w:tcW w:w="930" w:type="dxa"/>
+          <w:tcW w:w="937" w:type="dxa"/>
           <w:tcBorders>
             <w:top w:val="single" w:sz="2" w:space="0" w:color="auto"/>
             <w:left w:val="single" w:sz="2" w:space="0" w:color="auto"/>
@@ -1984,7 +1992,7 @@
       </w:trPr>
       <w:tc>
         <w:tcPr>
-          <w:tcW w:w="11084" w:type="dxa"/>
+          <w:tcW w:w="11170" w:type="dxa"/>
           <w:gridSpan w:val="11"/>
           <w:tcBorders>
             <w:top w:val="single" w:sz="18" w:space="0" w:color="auto"/>
@@ -2017,7 +2025,23 @@
               <w:rFonts w:ascii="標楷體" w:hAnsi="標楷體" w:cs="Arial"/>
               <w:szCs w:val="24"/>
             </w:rPr>
-            <w:t>(版本履歷只須保留後三個版本資料內容)</w:t>
+            <w:t>(版本履歷只須保留後三</w:t>
+          </w:r>
+          <w:proofErr w:type="gramStart"/>
+          <w:r>
+            <w:rPr>
+              <w:rFonts w:ascii="標楷體" w:hAnsi="標楷體" w:cs="Arial"/>
+              <w:szCs w:val="24"/>
+            </w:rPr>
+            <w:t>個</w:t>
+          </w:r>
+          <w:proofErr w:type="gramEnd"/>
+          <w:r>
+            <w:rPr>
+              <w:rFonts w:ascii="標楷體" w:hAnsi="標楷體" w:cs="Arial"/>
+              <w:szCs w:val="24"/>
+            </w:rPr>
+            <w:t>版本資料內容)</w:t>
           </w:r>
         </w:p>
       </w:tc>
@@ -2030,7 +2054,7 @@
       </w:trPr>
       <w:tc>
         <w:tcPr>
-          <w:tcW w:w="737" w:type="dxa"/>
+          <w:tcW w:w="743" w:type="dxa"/>
           <w:tcBorders>
             <w:top w:val="single" w:sz="8" w:space="0" w:color="auto"/>
             <w:left w:val="single" w:sz="18" w:space="0" w:color="auto"/>
@@ -2060,7 +2084,7 @@
       </w:tc>
       <w:tc>
         <w:tcPr>
-          <w:tcW w:w="1635" w:type="dxa"/>
+          <w:tcW w:w="1648" w:type="dxa"/>
           <w:tcBorders>
             <w:top w:val="single" w:sz="8" w:space="0" w:color="auto"/>
             <w:left w:val="single" w:sz="8" w:space="0" w:color="auto"/>
@@ -2106,7 +2130,7 @@
       </w:tc>
       <w:tc>
         <w:tcPr>
-          <w:tcW w:w="4319" w:type="dxa"/>
+          <w:tcW w:w="4352" w:type="dxa"/>
           <w:gridSpan w:val="2"/>
           <w:tcBorders>
             <w:top w:val="single" w:sz="8" w:space="0" w:color="auto"/>
@@ -2137,7 +2161,7 @@
       </w:tc>
       <w:tc>
         <w:tcPr>
-          <w:tcW w:w="1452" w:type="dxa"/>
+          <w:tcW w:w="1463" w:type="dxa"/>
           <w:gridSpan w:val="2"/>
           <w:tcBorders>
             <w:top w:val="single" w:sz="8" w:space="0" w:color="auto"/>
@@ -2168,7 +2192,7 @@
       </w:tc>
       <w:tc>
         <w:tcPr>
-          <w:tcW w:w="980" w:type="dxa"/>
+          <w:tcW w:w="988" w:type="dxa"/>
           <w:tcBorders>
             <w:top w:val="single" w:sz="8" w:space="0" w:color="auto"/>
             <w:left w:val="single" w:sz="4" w:space="0" w:color="auto"/>
@@ -2198,7 +2222,7 @@
       </w:tc>
       <w:tc>
         <w:tcPr>
-          <w:tcW w:w="980" w:type="dxa"/>
+          <w:tcW w:w="988" w:type="dxa"/>
           <w:gridSpan w:val="2"/>
           <w:tcBorders>
             <w:top w:val="single" w:sz="8" w:space="0" w:color="auto"/>
@@ -2229,7 +2253,7 @@
       </w:tc>
       <w:tc>
         <w:tcPr>
-          <w:tcW w:w="981" w:type="dxa"/>
+          <w:tcW w:w="988" w:type="dxa"/>
           <w:gridSpan w:val="2"/>
           <w:tcBorders>
             <w:top w:val="single" w:sz="8" w:space="0" w:color="auto"/>
@@ -2272,7 +2296,7 @@
 </w:hdr>
 </file>
 
-<file path=word/header3.xml><?xml version="1.0" encoding="utf-8"?>
+<file path=word/header2.xml><?xml version="1.0" encoding="utf-8"?>
 <w:hdr xmlns:wpc="http://schemas.microsoft.com/office/word/2010/wordprocessingCanvas" xmlns:cx="http://schemas.microsoft.com/office/drawing/2014/chartex" xmlns:cx1="http://schemas.microsoft.com/office/drawing/2015/9/8/chartex" xmlns:mc="http://schemas.openxmlformats.org/markup-compatibility/2006" xmlns:o="urn:schemas-microsoft-com:office:office" xmlns:r="http://schemas.openxmlformats.org/officeDocument/2006/relationships" xmlns:m="http://schemas.openxmlformats.org/officeDocument/2006/math" xmlns:v="urn:schemas-microsoft-com:vml" xmlns:wp14="http://schemas.microsoft.com/office/word/2010/wordprocessingDrawing" xmlns:wp="http://schemas.openxmlformats.org/drawingml/2006/wordprocessingDrawing" xmlns:w10="urn:schemas-microsoft-com:office:word" xmlns:w="http://schemas.openxmlformats.org/wordprocessingml/2006/main" xmlns:w14="http://schemas.microsoft.com/office/word/2010/wordml" xmlns:w15="http://schemas.microsoft.com/office/word/2012/wordml" xmlns:w16se="http://schemas.microsoft.com/office/word/2015/wordml/symex" xmlns:wpg="http://schemas.microsoft.com/office/word/2010/wordprocessingGroup" xmlns:wpi="http://schemas.microsoft.com/office/word/2010/wordprocessingInk" xmlns:wne="http://schemas.microsoft.com/office/word/2006/wordml" xmlns:wps="http://schemas.microsoft.com/office/word/2010/wordprocessingShape" mc:Ignorable="w14 w15 w16se wp14">
   <w:p>
     <w:pPr>
@@ -2299,7 +2323,7 @@
 </w:hdr>
 </file>
 
-<file path=word/header4.xml><?xml version="1.0" encoding="utf-8"?>
+<file path=word/header3.xml><?xml version="1.0" encoding="utf-8"?>
 <w:hdr xmlns:wpc="http://schemas.microsoft.com/office/word/2010/wordprocessingCanvas" xmlns:cx="http://schemas.microsoft.com/office/drawing/2014/chartex" xmlns:cx1="http://schemas.microsoft.com/office/drawing/2015/9/8/chartex" xmlns:mc="http://schemas.openxmlformats.org/markup-compatibility/2006" xmlns:o="urn:schemas-microsoft-com:office:office" xmlns:r="http://schemas.openxmlformats.org/officeDocument/2006/relationships" xmlns:m="http://schemas.openxmlformats.org/officeDocument/2006/math" xmlns:v="urn:schemas-microsoft-com:vml" xmlns:wp14="http://schemas.microsoft.com/office/word/2010/wordprocessingDrawing" xmlns:wp="http://schemas.openxmlformats.org/drawingml/2006/wordprocessingDrawing" xmlns:w10="urn:schemas-microsoft-com:office:word" xmlns:w="http://schemas.openxmlformats.org/wordprocessingml/2006/main" xmlns:w14="http://schemas.microsoft.com/office/word/2010/wordml" xmlns:w15="http://schemas.microsoft.com/office/word/2012/wordml" xmlns:w16se="http://schemas.microsoft.com/office/word/2015/wordml/symex" xmlns:wpg="http://schemas.microsoft.com/office/word/2010/wordprocessingGroup" xmlns:wpi="http://schemas.microsoft.com/office/word/2010/wordprocessingInk" xmlns:wne="http://schemas.microsoft.com/office/word/2006/wordml" xmlns:wps="http://schemas.microsoft.com/office/word/2010/wordprocessingShape" mc:Ignorable="w14 w15 w16se wp14">
   <w:p>
     <w:pPr>
@@ -2364,7 +2388,7 @@
       </w:trPr>
       <w:tc>
         <w:tcPr>
-          <w:tcW w:w="5162" w:type="dxa"/>
+          <w:tcW w:w="5254" w:type="dxa"/>
           <w:gridSpan w:val="2"/>
           <w:vMerge w:val="restart"/>
           <w:tcBorders>
@@ -2377,26 +2401,41 @@
         </w:tcPr>
         <w:p>
           <w:pPr>
+            <w:spacing w:line="240" w:lineRule="atLeast"/>
             <w:jc w:val="center"/>
             <w:rPr>
-              <w:rFonts w:ascii="標楷體"/>
+              <w:rFonts w:ascii="標楷體" w:hAnsi="標楷體"/>
               <w:sz w:val="56"/>
               <w:szCs w:val="56"/>
             </w:rPr>
           </w:pPr>
           <w:r>
             <w:rPr>
-              <w:rFonts w:ascii="標楷體"/>
+              <w:rFonts w:ascii="標楷體" w:hAnsi="標楷體" w:hint="eastAsia"/>
+              <w:spacing w:val="66"/>
+              <w:kern w:val="0"/>
               <w:sz w:val="56"/>
               <w:szCs w:val="56"/>
+              <w:fitText w:val="4710" w:id="-944602624"/>
             </w:rPr>
-            <w:t>TITLE</w:t>
+            <w:t>製造條件指示</w:t>
+          </w:r>
+          <w:r>
+            <w:rPr>
+              <w:rFonts w:ascii="標楷體" w:hAnsi="標楷體" w:hint="eastAsia"/>
+              <w:spacing w:val="-1"/>
+              <w:kern w:val="0"/>
+              <w:sz w:val="56"/>
+              <w:szCs w:val="56"/>
+              <w:fitText w:val="4710" w:id="-944602624"/>
+            </w:rPr>
+            <w:t>書</w:t>
           </w:r>
         </w:p>
       </w:tc>
       <w:tc>
         <w:tcPr>
-          <w:tcW w:w="1412" w:type="dxa"/>
+          <w:tcW w:w="1438" w:type="dxa"/>
           <w:tcBorders>
             <w:top w:val="single" w:sz="18" w:space="0" w:color="auto"/>
             <w:left w:val="single" w:sz="18" w:space="0" w:color="auto"/>
@@ -2422,7 +2461,7 @@
       </w:tc>
       <w:tc>
         <w:tcPr>
-          <w:tcW w:w="2566" w:type="dxa"/>
+          <w:tcW w:w="2613" w:type="dxa"/>
           <w:tcBorders>
             <w:top w:val="single" w:sz="18" w:space="0" w:color="auto"/>
             <w:left w:val="single" w:sz="2" w:space="0" w:color="auto"/>
@@ -2448,7 +2487,7 @@
       </w:tc>
       <w:tc>
         <w:tcPr>
-          <w:tcW w:w="915" w:type="dxa"/>
+          <w:tcW w:w="932" w:type="dxa"/>
           <w:tcBorders>
             <w:top w:val="single" w:sz="18" w:space="0" w:color="auto"/>
             <w:left w:val="single" w:sz="2" w:space="0" w:color="auto"/>
@@ -2474,7 +2513,7 @@
       </w:tc>
       <w:tc>
         <w:tcPr>
-          <w:tcW w:w="916" w:type="dxa"/>
+          <w:tcW w:w="933" w:type="dxa"/>
           <w:tcBorders>
             <w:top w:val="single" w:sz="18" w:space="0" w:color="auto"/>
             <w:left w:val="single" w:sz="2" w:space="0" w:color="auto"/>
@@ -2507,7 +2546,7 @@
       </w:trPr>
       <w:tc>
         <w:tcPr>
-          <w:tcW w:w="5162" w:type="dxa"/>
+          <w:tcW w:w="5254" w:type="dxa"/>
           <w:gridSpan w:val="2"/>
           <w:vMerge/>
           <w:tcBorders>
@@ -2525,7 +2564,7 @@
       </w:tc>
       <w:tc>
         <w:tcPr>
-          <w:tcW w:w="1412" w:type="dxa"/>
+          <w:tcW w:w="1438" w:type="dxa"/>
           <w:tcBorders>
             <w:top w:val="single" w:sz="2" w:space="0" w:color="auto"/>
             <w:left w:val="single" w:sz="18" w:space="0" w:color="auto"/>
@@ -2551,7 +2590,7 @@
       </w:tc>
       <w:tc>
         <w:tcPr>
-          <w:tcW w:w="2566" w:type="dxa"/>
+          <w:tcW w:w="2613" w:type="dxa"/>
           <w:tcBorders>
             <w:top w:val="single" w:sz="2" w:space="0" w:color="auto"/>
             <w:left w:val="single" w:sz="2" w:space="0" w:color="auto"/>
@@ -2577,7 +2616,7 @@
       </w:tc>
       <w:tc>
         <w:tcPr>
-          <w:tcW w:w="915" w:type="dxa"/>
+          <w:tcW w:w="932" w:type="dxa"/>
           <w:tcBorders>
             <w:top w:val="single" w:sz="2" w:space="0" w:color="auto"/>
             <w:left w:val="single" w:sz="2" w:space="0" w:color="auto"/>
@@ -2603,7 +2642,7 @@
       </w:tc>
       <w:tc>
         <w:tcPr>
-          <w:tcW w:w="916" w:type="dxa"/>
+          <w:tcW w:w="933" w:type="dxa"/>
           <w:tcBorders>
             <w:top w:val="single" w:sz="2" w:space="0" w:color="auto"/>
             <w:left w:val="single" w:sz="2" w:space="0" w:color="auto"/>
@@ -2638,7 +2677,7 @@
       </w:trPr>
       <w:tc>
         <w:tcPr>
-          <w:tcW w:w="1828" w:type="dxa"/>
+          <w:tcW w:w="1860" w:type="dxa"/>
           <w:tcBorders>
             <w:top w:val="single" w:sz="18" w:space="0" w:color="auto"/>
             <w:left w:val="single" w:sz="18" w:space="0" w:color="auto"/>
@@ -2666,7 +2705,7 @@
       </w:tc>
       <w:tc>
         <w:tcPr>
-          <w:tcW w:w="9143" w:type="dxa"/>
+          <w:tcW w:w="9310" w:type="dxa"/>
           <w:gridSpan w:val="5"/>
           <w:tcBorders>
             <w:top w:val="single" w:sz="18" w:space="0" w:color="auto"/>
@@ -2703,7 +2742,7 @@
       </w:trPr>
       <w:tc>
         <w:tcPr>
-          <w:tcW w:w="1828" w:type="dxa"/>
+          <w:tcW w:w="1860" w:type="dxa"/>
           <w:tcBorders>
             <w:top w:val="single" w:sz="8" w:space="0" w:color="auto"/>
             <w:left w:val="single" w:sz="18" w:space="0" w:color="auto"/>
@@ -2731,7 +2770,7 @@
       </w:tc>
       <w:tc>
         <w:tcPr>
-          <w:tcW w:w="9143" w:type="dxa"/>
+          <w:tcW w:w="9310" w:type="dxa"/>
           <w:gridSpan w:val="5"/>
           <w:tcBorders>
             <w:top w:val="single" w:sz="8" w:space="0" w:color="auto"/>
@@ -7679,7 +7718,7 @@
 </file>
 
 <file path=customXml/itemProps1.xml><?xml version="1.0" encoding="utf-8"?>
-<ds:datastoreItem xmlns:ds="http://schemas.openxmlformats.org/officeDocument/2006/customXml" ds:itemID="{1FEC29F2-C255-4E84-A70D-2253A9357B91}">
+<ds:datastoreItem xmlns:ds="http://schemas.openxmlformats.org/officeDocument/2006/customXml" ds:itemID="{D2C2530B-2D56-49DC-94E1-46B189D41A9C}">
   <ds:schemaRefs>
     <ds:schemaRef ds:uri="http://schemas.openxmlformats.org/officeDocument/2006/bibliography"/>
   </ds:schemaRefs>

</xml_diff>